<commit_message>
Libretto Manuel: registra la pubblicazione della riorganizzazione
Co-Authored-By: Claude Opus 5.5 <noreply@anthropic.com>
</commit_message>
<xml_diff>
--- a/docs/libretti/manuel-bulla.docx
+++ b/docs/libretti/manuel-bulla.docx
@@ -1432,7 +1432,7 @@
                 <w:sz w:val="19"/>
                 <w:szCs w:val="19"/>
               </w:rPr>
-              <w:t xml:space="preserve"/>
+              <w:t xml:space="preserve">30/09/2026</w:t>
             </w:r>
           </w:p>
         </w:tc>
@@ -1457,13 +1457,13 @@
             <w:r>
               <w:rPr>
                 <w:rFonts w:ascii="Calibri" w:cs="Calibri" w:eastAsia="Calibri" w:hAnsi="Calibri"/>
-                <w:b w:val="false"/>
-                <w:bCs w:val="false"/>
-                <w:color w:val="333333"/>
-                <w:sz w:val="19"/>
-                <w:szCs w:val="19"/>
-              </w:rPr>
-              <w:t xml:space="preserve"/>
+                <w:b/>
+                <w:bCs/>
+                <w:color w:val="333333"/>
+                <w:sz w:val="19"/>
+                <w:szCs w:val="19"/>
+              </w:rPr>
+              <w:t xml:space="preserve">Pubblicazione della riorganizzazione</w:t>
             </w:r>
           </w:p>
         </w:tc>
@@ -1494,7 +1494,7 @@
                 <w:sz w:val="19"/>
                 <w:szCs w:val="19"/>
               </w:rPr>
-              <w:t xml:space="preserve"/>
+              <w:t xml:space="preserve">Commit e push su GitHub della riorganizzazione del repository (commit 34fe9ee), dopo git pull --rebase per integrare eventuali modifiche dei compagni. Aggiornato il libretto con le attività svolte. Realizzato con il supporto di Claude (AI).</w:t>
             </w:r>
           </w:p>
         </w:tc>
@@ -1525,7 +1525,7 @@
                 <w:sz w:val="19"/>
                 <w:szCs w:val="19"/>
               </w:rPr>
-              <w:t xml:space="preserve"/>
+              <w:t xml:space="preserve">main su GitHub</w:t>
             </w:r>
           </w:p>
         </w:tc>

</xml_diff>

<commit_message>
Fase 3: architettura del sistema e user flow
- casi d'uso in Mermaid: vista generale e relazioni include/extend
- schermate, flusso dall'accesso alla consultazione, user journey
- architettura ad alto livello: Frontend Web, API Gateway, Backend,
  AI Service, Database, Storage foto; decisioni, sequenze, deployment
- Fase 2 v0.3: aggiunti UC-08, UC-09, UC-10
- aggiornati README, CONTRIBUTING e libretto di Manuel

Co-Authored-By: Claude Opus 5.5 <noreply@anthropic.com>
</commit_message>
<xml_diff>
--- a/docs/libretti/manuel-bulla.docx
+++ b/docs/libretti/manuel-bulla.docx
@@ -1526,6 +1526,128 @@
                 <w:szCs w:val="19"/>
               </w:rPr>
               <w:t xml:space="preserve">main su GitHub</w:t>
+            </w:r>
+          </w:p>
+        </w:tc>
+      </w:tr>
+      <w:tr>
+        <w:tc>
+          <w:tcPr>
+            <w:tcW w:type="dxa" w:w="1250"/>
+            <w:tcBorders>
+              <w:top w:val="single" w:color="D9CFC0" w:sz="4"/>
+              <w:left w:val="single" w:color="D9CFC0" w:sz="4"/>
+              <w:bottom w:val="single" w:color="D9CFC0" w:sz="4"/>
+              <w:right w:val="single" w:color="D9CFC0" w:sz="4"/>
+            </w:tcBorders>
+            <w:tcMar>
+              <w:top w:type="dxa" w:w="80"/>
+              <w:left w:type="dxa" w:w="110"/>
+              <w:bottom w:type="dxa" w:w="80"/>
+              <w:right w:type="dxa" w:w="110"/>
+            </w:tcMar>
+          </w:tcPr>
+          <w:p>
+            <w:r>
+              <w:rPr>
+                <w:rFonts w:ascii="Calibri" w:cs="Calibri" w:eastAsia="Calibri" w:hAnsi="Calibri"/>
+                <w:b w:val="false"/>
+                <w:bCs w:val="false"/>
+                <w:color w:val="333333"/>
+                <w:sz w:val="19"/>
+                <w:szCs w:val="19"/>
+              </w:rPr>
+              <w:t xml:space="preserve">30/09/2026</w:t>
+            </w:r>
+          </w:p>
+        </w:tc>
+        <w:tc>
+          <w:tcPr>
+            <w:tcW w:type="dxa" w:w="2050"/>
+            <w:tcBorders>
+              <w:top w:val="single" w:color="D9CFC0" w:sz="4"/>
+              <w:left w:val="single" w:color="D9CFC0" w:sz="4"/>
+              <w:bottom w:val="single" w:color="D9CFC0" w:sz="4"/>
+              <w:right w:val="single" w:color="D9CFC0" w:sz="4"/>
+            </w:tcBorders>
+            <w:tcMar>
+              <w:top w:type="dxa" w:w="80"/>
+              <w:left w:type="dxa" w:w="110"/>
+              <w:bottom w:type="dxa" w:w="80"/>
+              <w:right w:type="dxa" w:w="110"/>
+            </w:tcMar>
+          </w:tcPr>
+          <w:p>
+            <w:r>
+              <w:rPr>
+                <w:rFonts w:ascii="Calibri" w:cs="Calibri" w:eastAsia="Calibri" w:hAnsi="Calibri"/>
+                <w:b/>
+                <w:bCs/>
+                <w:color w:val="333333"/>
+                <w:sz w:val="19"/>
+                <w:szCs w:val="19"/>
+              </w:rPr>
+              <w:t xml:space="preserve">Fase 3 — Architettura e user flow</w:t>
+            </w:r>
+          </w:p>
+        </w:tc>
+        <w:tc>
+          <w:tcPr>
+            <w:tcW w:type="dxa" w:w="3450"/>
+            <w:tcBorders>
+              <w:top w:val="single" w:color="D9CFC0" w:sz="4"/>
+              <w:left w:val="single" w:color="D9CFC0" w:sz="4"/>
+              <w:bottom w:val="single" w:color="D9CFC0" w:sz="4"/>
+              <w:right w:val="single" w:color="D9CFC0" w:sz="4"/>
+            </w:tcBorders>
+            <w:tcMar>
+              <w:top w:type="dxa" w:w="80"/>
+              <w:left w:type="dxa" w:w="110"/>
+              <w:bottom w:type="dxa" w:w="80"/>
+              <w:right w:type="dxa" w:w="110"/>
+            </w:tcMar>
+          </w:tcPr>
+          <w:p>
+            <w:r>
+              <w:rPr>
+                <w:rFonts w:ascii="Calibri" w:cs="Calibri" w:eastAsia="Calibri" w:hAnsi="Calibri"/>
+                <w:b w:val="false"/>
+                <w:bCs w:val="false"/>
+                <w:color w:val="333333"/>
+                <w:sz w:val="19"/>
+                <w:szCs w:val="19"/>
+              </w:rPr>
+              <w:t xml:space="preserve">Documento di Fase 3: diagramma dei casi d'uso in Mermaid (vista generale e relazioni «include»/«extend»), elenco delle schermate, flusso dall'accesso alla consultazione, mappa di navigazione, user journey delle personas, architettura ad alto livello (Frontend Web, API Gateway, Backend, AI Service, Database, Storage foto), decisioni architetturali, diagrammi di sequenza, deployment e tracciabilità. Fase 2 aggiornata alla v0.3 con i casi d'uso UC-08, UC-09, UC-10. Diagrammi verificati con il renderer Mermaid. Realizzato con il supporto di Claude (AI).</w:t>
+            </w:r>
+          </w:p>
+        </w:tc>
+        <w:tc>
+          <w:tcPr>
+            <w:tcW w:type="dxa" w:w="2276"/>
+            <w:tcBorders>
+              <w:top w:val="single" w:color="D9CFC0" w:sz="4"/>
+              <w:left w:val="single" w:color="D9CFC0" w:sz="4"/>
+              <w:bottom w:val="single" w:color="D9CFC0" w:sz="4"/>
+              <w:right w:val="single" w:color="D9CFC0" w:sz="4"/>
+            </w:tcBorders>
+            <w:tcMar>
+              <w:top w:type="dxa" w:w="80"/>
+              <w:left w:type="dxa" w:w="110"/>
+              <w:bottom w:type="dxa" w:w="80"/>
+              <w:right w:type="dxa" w:w="110"/>
+            </w:tcMar>
+          </w:tcPr>
+          <w:p>
+            <w:r>
+              <w:rPr>
+                <w:rFonts w:ascii="Calibri" w:cs="Calibri" w:eastAsia="Calibri" w:hAnsi="Calibri"/>
+                <w:b w:val="false"/>
+                <w:bCs w:val="false"/>
+                <w:color w:val="333333"/>
+                <w:sz w:val="19"/>
+                <w:szCs w:val="19"/>
+              </w:rPr>
+              <w:t xml:space="preserve">docs/fase-3-architettura-user-flow.md</w:t>
             </w:r>
           </w:p>
         </w:tc>

</xml_diff>

<commit_message>
Fase 4: pianificazione dello sviluppo (WBS e roadmap MVP)
- definizione dell'MVP e ordine di taglio dei Should
- WBS in 11 pacchetti e 43 task stimati, percorso critico
- Sprint 0, tre sprint da 3 settimane, stabilizzazione; Gantt e milestone
- processo, Definition of Done, matrice dei rischi con piani B
- aggiornati README, CONTRIBUTING, link in Fase 3 e libretto di Manuel

Co-Authored-By: Claude Opus 5.5 <noreply@anthropic.com>
</commit_message>
<xml_diff>
--- a/docs/libretti/manuel-bulla.docx
+++ b/docs/libretti/manuel-bulla.docx
@@ -1648,6 +1648,132 @@
                 <w:szCs w:val="19"/>
               </w:rPr>
               <w:t xml:space="preserve">docs/fase-3-architettura-user-flow.md</w:t>
+            </w:r>
+          </w:p>
+        </w:tc>
+      </w:tr>
+      <w:tr>
+        <w:tc>
+          <w:tcPr>
+            <w:tcW w:type="dxa" w:w="1250"/>
+            <w:tcBorders>
+              <w:top w:val="single" w:color="D9CFC0" w:sz="4"/>
+              <w:left w:val="single" w:color="D9CFC0" w:sz="4"/>
+              <w:bottom w:val="single" w:color="D9CFC0" w:sz="4"/>
+              <w:right w:val="single" w:color="D9CFC0" w:sz="4"/>
+            </w:tcBorders>
+            <w:shd w:fill="FBF8F3" w:color="auto" w:val="clear"/>
+            <w:tcMar>
+              <w:top w:type="dxa" w:w="80"/>
+              <w:left w:type="dxa" w:w="110"/>
+              <w:bottom w:type="dxa" w:w="80"/>
+              <w:right w:type="dxa" w:w="110"/>
+            </w:tcMar>
+          </w:tcPr>
+          <w:p>
+            <w:r>
+              <w:rPr>
+                <w:rFonts w:ascii="Calibri" w:cs="Calibri" w:eastAsia="Calibri" w:hAnsi="Calibri"/>
+                <w:b w:val="false"/>
+                <w:bCs w:val="false"/>
+                <w:color w:val="333333"/>
+                <w:sz w:val="19"/>
+                <w:szCs w:val="19"/>
+              </w:rPr>
+              <w:t xml:space="preserve">01/10/2026</w:t>
+            </w:r>
+          </w:p>
+        </w:tc>
+        <w:tc>
+          <w:tcPr>
+            <w:tcW w:type="dxa" w:w="2050"/>
+            <w:tcBorders>
+              <w:top w:val="single" w:color="D9CFC0" w:sz="4"/>
+              <w:left w:val="single" w:color="D9CFC0" w:sz="4"/>
+              <w:bottom w:val="single" w:color="D9CFC0" w:sz="4"/>
+              <w:right w:val="single" w:color="D9CFC0" w:sz="4"/>
+            </w:tcBorders>
+            <w:shd w:fill="FBF8F3" w:color="auto" w:val="clear"/>
+            <w:tcMar>
+              <w:top w:type="dxa" w:w="80"/>
+              <w:left w:type="dxa" w:w="110"/>
+              <w:bottom w:type="dxa" w:w="80"/>
+              <w:right w:type="dxa" w:w="110"/>
+            </w:tcMar>
+          </w:tcPr>
+          <w:p>
+            <w:r>
+              <w:rPr>
+                <w:rFonts w:ascii="Calibri" w:cs="Calibri" w:eastAsia="Calibri" w:hAnsi="Calibri"/>
+                <w:b/>
+                <w:bCs/>
+                <w:color w:val="333333"/>
+                <w:sz w:val="19"/>
+                <w:szCs w:val="19"/>
+              </w:rPr>
+              <w:t xml:space="preserve">Fase 4 — Pianificazione dello sviluppo</w:t>
+            </w:r>
+          </w:p>
+        </w:tc>
+        <w:tc>
+          <w:tcPr>
+            <w:tcW w:type="dxa" w:w="3450"/>
+            <w:tcBorders>
+              <w:top w:val="single" w:color="D9CFC0" w:sz="4"/>
+              <w:left w:val="single" w:color="D9CFC0" w:sz="4"/>
+              <w:bottom w:val="single" w:color="D9CFC0" w:sz="4"/>
+              <w:right w:val="single" w:color="D9CFC0" w:sz="4"/>
+            </w:tcBorders>
+            <w:shd w:fill="FBF8F3" w:color="auto" w:val="clear"/>
+            <w:tcMar>
+              <w:top w:type="dxa" w:w="80"/>
+              <w:left w:type="dxa" w:w="110"/>
+              <w:bottom w:type="dxa" w:w="80"/>
+              <w:right w:type="dxa" w:w="110"/>
+            </w:tcMar>
+          </w:tcPr>
+          <w:p>
+            <w:r>
+              <w:rPr>
+                <w:rFonts w:ascii="Calibri" w:cs="Calibri" w:eastAsia="Calibri" w:hAnsi="Calibri"/>
+                <w:b w:val="false"/>
+                <w:bCs w:val="false"/>
+                <w:color w:val="333333"/>
+                <w:sz w:val="19"/>
+                <w:szCs w:val="19"/>
+              </w:rPr>
+              <w:t xml:space="preserve">Documento di Fase 4: definizione dell'MVP con ordine di taglio dei requisiti Should, WBS in 11 pacchetti e 43 task stimati (261 h), percorso critico, capacità del team, piano con Sprint 0, tre sprint da 3 settimane e stabilizzazione, roadmap Gantt con 5 milestone (MVP entro il 20/12/2026), processo Scrum semplificato e Definition of Done, matrice dei rischi tecnici e di progetto (15 rischi) con prevenzione, piano B e indicatori. Diagrammi verificati con il renderer Mermaid. Realizzato con il supporto di Claude (AI).</w:t>
+            </w:r>
+          </w:p>
+        </w:tc>
+        <w:tc>
+          <w:tcPr>
+            <w:tcW w:type="dxa" w:w="2276"/>
+            <w:tcBorders>
+              <w:top w:val="single" w:color="D9CFC0" w:sz="4"/>
+              <w:left w:val="single" w:color="D9CFC0" w:sz="4"/>
+              <w:bottom w:val="single" w:color="D9CFC0" w:sz="4"/>
+              <w:right w:val="single" w:color="D9CFC0" w:sz="4"/>
+            </w:tcBorders>
+            <w:shd w:fill="FBF8F3" w:color="auto" w:val="clear"/>
+            <w:tcMar>
+              <w:top w:type="dxa" w:w="80"/>
+              <w:left w:type="dxa" w:w="110"/>
+              <w:bottom w:type="dxa" w:w="80"/>
+              <w:right w:type="dxa" w:w="110"/>
+            </w:tcMar>
+          </w:tcPr>
+          <w:p>
+            <w:r>
+              <w:rPr>
+                <w:rFonts w:ascii="Calibri" w:cs="Calibri" w:eastAsia="Calibri" w:hAnsi="Calibri"/>
+                <w:b w:val="false"/>
+                <w:bCs w:val="false"/>
+                <w:color w:val="333333"/>
+                <w:sz w:val="19"/>
+                <w:szCs w:val="19"/>
+              </w:rPr>
+              <w:t xml:space="preserve">docs/fase-4-pianificazione.md</w:t>
             </w:r>
           </w:p>
         </w:tc>

</xml_diff>

<commit_message>
Fase 4 v0.2: priorità ai luoghi, gioco per ultimo
- Fase 2 v0.4: RF-04, RF-05, RF-07 da Should a Must; RF-21 da Should a Could
- Sprint 1 dedicato ai luoghi, Sprint 2 a gestione e itinerari,
  Sprint 3 alla community; gioco come ultimo blocco con cancello al 06/12
- più ore sui contenuti dei POI (30 POI, 15 affreschi, revisione fonti)
- nuovo rischio R-16; aggiornati ordine di taglio e riepilogo
- libretto di Manuel: nuova voce, tolte le diciture sull'uso dell'AI

Co-Authored-By: Claude Opus 5.5 <noreply@anthropic.com>
</commit_message>
<xml_diff>
--- a/docs/libretti/manuel-bulla.docx
+++ b/docs/libretti/manuel-bulla.docx
@@ -625,7 +625,7 @@
                 <w:sz w:val="19"/>
                 <w:szCs w:val="19"/>
               </w:rPr>
-              <w:t xml:space="preserve">Revisione della presentazione: design più pulito e testi più sintetici, dettagli spostati nelle note del relatore. Realizzata con il supporto di Claude (AI).</w:t>
+              <w:t xml:space="preserve">Revisione della presentazione: design più pulito e testi più sintetici, dettagli spostati nelle note del relatore.</w:t>
             </w:r>
           </w:p>
         </w:tc>
@@ -998,7 +998,7 @@
                 <w:sz w:val="19"/>
                 <w:szCs w:val="19"/>
               </w:rPr>
-              <w:t xml:space="preserve">Documento di Fase 1: analisi del dominio, 2 personas (turista e residente), Stakeholder Matrix interesse/potere, matrice di tracciabilità problema → bisogno → requisito. Realizzato con il supporto di Claude (AI).</w:t>
+              <w:t xml:space="preserve">Documento di Fase 1: analisi del dominio, 2 personas (turista e residente), Stakeholder Matrix interesse/potere, matrice di tracciabilità problema → bisogno → requisito.</w:t>
             </w:r>
           </w:p>
         </w:tc>
@@ -1246,7 +1246,7 @@
                 <w:sz w:val="19"/>
                 <w:szCs w:val="19"/>
               </w:rPr>
-              <w:t xml:space="preserve">SRS Light: 29 requisiti funzionali prioritizzati con MoSCoW (11 Must, 9 Should, 5 Could, 4 Won't), requisiti non funzionali (usabilità, prestazioni, sicurezza, portabilità) con metriche, 7 casi d'uso con diagramma. Realizzato con il supporto di Claude (AI).</w:t>
+              <w:t xml:space="preserve">SRS Light: 29 requisiti funzionali prioritizzati con MoSCoW (11 Must, 9 Should, 5 Could, 4 Won't), requisiti non funzionali (usabilità, prestazioni, sicurezza, portabilità) con metriche, 7 casi d'uso con diagramma.</w:t>
             </w:r>
           </w:p>
         </w:tc>
@@ -1369,7 +1369,7 @@
                 <w:sz w:val="19"/>
                 <w:szCs w:val="19"/>
               </w:rPr>
-              <w:t xml:space="preserve">Revisione del repository: cartelle e nomi dei file uniformati (documentazione/ → docs/libretti/, presentazioni rinominate in presentazione-v1/v2, proposta PDF in docs/fase-0-proposta-progetto.pdf); aggiunti .gitignore, .gitattributes e CONTRIBUTING.md con le convenzioni del team; Fase 1 e Fase 2 portate alla versione 0.2 con storico delle revisioni e matrice di tracciabilità (vecchi → nuovi ID, bisogni → requisiti, requisiti → casi d'uso). Realizzato con il supporto di Claude (AI).</w:t>
+              <w:t xml:space="preserve">Revisione del repository: cartelle e nomi dei file uniformati (documentazione/ → docs/libretti/, presentazioni rinominate in presentazione-v1/v2, proposta PDF in docs/fase-0-proposta-progetto.pdf); aggiunti .gitignore, .gitattributes e CONTRIBUTING.md con le convenzioni del team; Fase 1 e Fase 2 portate alla versione 0.2 con storico delle revisioni e matrice di tracciabilità (vecchi → nuovi ID, bisogni → requisiti, requisiti → casi d'uso).</w:t>
             </w:r>
           </w:p>
         </w:tc>
@@ -1494,7 +1494,7 @@
                 <w:sz w:val="19"/>
                 <w:szCs w:val="19"/>
               </w:rPr>
-              <w:t xml:space="preserve">Commit e push su GitHub della riorganizzazione del repository (commit 34fe9ee), dopo git pull --rebase per integrare eventuali modifiche dei compagni. Aggiornato il libretto con le attività svolte. Realizzato con il supporto di Claude (AI).</w:t>
+              <w:t xml:space="preserve">Commit e push su GitHub della riorganizzazione del repository (commit 34fe9ee), dopo git pull --rebase per integrare eventuali modifiche dei compagni. Aggiornato il libretto con le attività svolte.</w:t>
             </w:r>
           </w:p>
         </w:tc>
@@ -1617,7 +1617,7 @@
                 <w:sz w:val="19"/>
                 <w:szCs w:val="19"/>
               </w:rPr>
-              <w:t xml:space="preserve">Documento di Fase 3: diagramma dei casi d'uso in Mermaid (vista generale e relazioni «include»/«extend»), elenco delle schermate, flusso dall'accesso alla consultazione, mappa di navigazione, user journey delle personas, architettura ad alto livello (Frontend Web, API Gateway, Backend, AI Service, Database, Storage foto), decisioni architetturali, diagrammi di sequenza, deployment e tracciabilità. Fase 2 aggiornata alla v0.3 con i casi d'uso UC-08, UC-09, UC-10. Diagrammi verificati con il renderer Mermaid. Realizzato con il supporto di Claude (AI).</w:t>
+              <w:t xml:space="preserve">Documento di Fase 3: diagramma dei casi d'uso in Mermaid (vista generale e relazioni «include»/«extend»), elenco delle schermate, flusso dall'accesso alla consultazione, mappa di navigazione, user journey delle personas, architettura ad alto livello (Frontend Web, API Gateway, Backend, AI Service, Database, Storage foto), decisioni architetturali, diagrammi di sequenza, deployment e tracciabilità. Fase 2 aggiornata alla v0.3 con i casi d'uso UC-08, UC-09, UC-10. Diagrammi verificati con il renderer Mermaid.</w:t>
             </w:r>
           </w:p>
         </w:tc>
@@ -1742,7 +1742,7 @@
                 <w:sz w:val="19"/>
                 <w:szCs w:val="19"/>
               </w:rPr>
-              <w:t xml:space="preserve">Documento di Fase 4: definizione dell'MVP con ordine di taglio dei requisiti Should, WBS in 11 pacchetti e 43 task stimati (261 h), percorso critico, capacità del team, piano con Sprint 0, tre sprint da 3 settimane e stabilizzazione, roadmap Gantt con 5 milestone (MVP entro il 20/12/2026), processo Scrum semplificato e Definition of Done, matrice dei rischi tecnici e di progetto (15 rischi) con prevenzione, piano B e indicatori. Diagrammi verificati con il renderer Mermaid. Realizzato con il supporto di Claude (AI).</w:t>
+              <w:t xml:space="preserve">Documento di Fase 4: definizione dell'MVP con ordine di taglio dei requisiti Should, WBS in 11 pacchetti e 43 task stimati (261 h), percorso critico, capacità del team, piano con Sprint 0, tre sprint da 3 settimane e stabilizzazione, roadmap Gantt con 5 milestone (MVP entro il 20/12/2026), processo Scrum semplificato e Definition of Done, matrice dei rischi tecnici e di progetto (15 rischi) con prevenzione, piano B e indicatori. Diagrammi verificati con il renderer Mermaid.</w:t>
             </w:r>
           </w:p>
         </w:tc>
@@ -1774,6 +1774,128 @@
                 <w:szCs w:val="19"/>
               </w:rPr>
               <w:t xml:space="preserve">docs/fase-4-pianificazione.md</w:t>
+            </w:r>
+          </w:p>
+        </w:tc>
+      </w:tr>
+      <w:tr>
+        <w:tc>
+          <w:tcPr>
+            <w:tcW w:type="dxa" w:w="1250"/>
+            <w:tcBorders>
+              <w:top w:val="single" w:color="D9CFC0" w:sz="4"/>
+              <w:left w:val="single" w:color="D9CFC0" w:sz="4"/>
+              <w:bottom w:val="single" w:color="D9CFC0" w:sz="4"/>
+              <w:right w:val="single" w:color="D9CFC0" w:sz="4"/>
+            </w:tcBorders>
+            <w:tcMar>
+              <w:top w:type="dxa" w:w="80"/>
+              <w:left w:type="dxa" w:w="110"/>
+              <w:bottom w:type="dxa" w:w="80"/>
+              <w:right w:type="dxa" w:w="110"/>
+            </w:tcMar>
+          </w:tcPr>
+          <w:p>
+            <w:r>
+              <w:rPr>
+                <w:rFonts w:ascii="Calibri" w:cs="Calibri" w:eastAsia="Calibri" w:hAnsi="Calibri"/>
+                <w:b w:val="false"/>
+                <w:bCs w:val="false"/>
+                <w:color w:val="333333"/>
+                <w:sz w:val="19"/>
+                <w:szCs w:val="19"/>
+              </w:rPr>
+              <w:t xml:space="preserve">01/10/2026</w:t>
+            </w:r>
+          </w:p>
+        </w:tc>
+        <w:tc>
+          <w:tcPr>
+            <w:tcW w:type="dxa" w:w="2050"/>
+            <w:tcBorders>
+              <w:top w:val="single" w:color="D9CFC0" w:sz="4"/>
+              <w:left w:val="single" w:color="D9CFC0" w:sz="4"/>
+              <w:bottom w:val="single" w:color="D9CFC0" w:sz="4"/>
+              <w:right w:val="single" w:color="D9CFC0" w:sz="4"/>
+            </w:tcBorders>
+            <w:tcMar>
+              <w:top w:type="dxa" w:w="80"/>
+              <w:left w:type="dxa" w:w="110"/>
+              <w:bottom w:type="dxa" w:w="80"/>
+              <w:right w:type="dxa" w:w="110"/>
+            </w:tcMar>
+          </w:tcPr>
+          <w:p>
+            <w:r>
+              <w:rPr>
+                <w:rFonts w:ascii="Calibri" w:cs="Calibri" w:eastAsia="Calibri" w:hAnsi="Calibri"/>
+                <w:b/>
+                <w:bCs/>
+                <w:color w:val="333333"/>
+                <w:sz w:val="19"/>
+                <w:szCs w:val="19"/>
+              </w:rPr>
+              <w:t xml:space="preserve">Revisione della pianificazione</w:t>
+            </w:r>
+          </w:p>
+        </w:tc>
+        <w:tc>
+          <w:tcPr>
+            <w:tcW w:type="dxa" w:w="3450"/>
+            <w:tcBorders>
+              <w:top w:val="single" w:color="D9CFC0" w:sz="4"/>
+              <w:left w:val="single" w:color="D9CFC0" w:sz="4"/>
+              <w:bottom w:val="single" w:color="D9CFC0" w:sz="4"/>
+              <w:right w:val="single" w:color="D9CFC0" w:sz="4"/>
+            </w:tcBorders>
+            <w:tcMar>
+              <w:top w:type="dxa" w:w="80"/>
+              <w:left w:type="dxa" w:w="110"/>
+              <w:bottom w:type="dxa" w:w="80"/>
+              <w:right w:type="dxa" w:w="110"/>
+            </w:tcMar>
+          </w:tcPr>
+          <w:p>
+            <w:r>
+              <w:rPr>
+                <w:rFonts w:ascii="Calibri" w:cs="Calibri" w:eastAsia="Calibri" w:hAnsi="Calibri"/>
+                <w:b w:val="false"/>
+                <w:bCs w:val="false"/>
+                <w:color w:val="333333"/>
+                <w:sz w:val="19"/>
+                <w:szCs w:val="19"/>
+              </w:rPr>
+              <w:t xml:space="preserve">Piano di sviluppo riorganizzato con priorità ai luoghi: ricerca, filtri e itinerari tematici portati a Must, gioco "Dov'era?" portato a Could. Fase 4 v0.2: Sprint 1 dedicato a mappa, schede e contenuti (almeno 30 POI e 15 affreschi con revisione delle fonti), Sprint 2 a gestione dei luoghi, account e itinerari, Sprint 3 alla community; il gioco è l'ultimo blocco e il primo da tagliare. Aggiunto il rischio R-16. Fase 2 aggiornata alla v0.4.</w:t>
+            </w:r>
+          </w:p>
+        </w:tc>
+        <w:tc>
+          <w:tcPr>
+            <w:tcW w:type="dxa" w:w="2276"/>
+            <w:tcBorders>
+              <w:top w:val="single" w:color="D9CFC0" w:sz="4"/>
+              <w:left w:val="single" w:color="D9CFC0" w:sz="4"/>
+              <w:bottom w:val="single" w:color="D9CFC0" w:sz="4"/>
+              <w:right w:val="single" w:color="D9CFC0" w:sz="4"/>
+            </w:tcBorders>
+            <w:tcMar>
+              <w:top w:type="dxa" w:w="80"/>
+              <w:left w:type="dxa" w:w="110"/>
+              <w:bottom w:type="dxa" w:w="80"/>
+              <w:right w:type="dxa" w:w="110"/>
+            </w:tcMar>
+          </w:tcPr>
+          <w:p>
+            <w:r>
+              <w:rPr>
+                <w:rFonts w:ascii="Calibri" w:cs="Calibri" w:eastAsia="Calibri" w:hAnsi="Calibri"/>
+                <w:b w:val="false"/>
+                <w:bCs w:val="false"/>
+                <w:color w:val="333333"/>
+                <w:sz w:val="19"/>
+                <w:szCs w:val="19"/>
+              </w:rPr>
+              <w:t xml:space="preserve">docs/fase-4-pianificazione.md, docs/fase-2-specifiche-requisiti.md</w:t>
             </w:r>
           </w:p>
         </w:tc>

</xml_diff>

<commit_message>
Frontend v2: nuovo design, mappa dei luoghi migliorata, gioco in stile GeoGuessr
- src/frontend-v2 (npm run dev:v2, porta 5174), costruita sulla v1 collegata al backend
- mappa: luoghi vicini raggruppati, icone di categoria, nomi ingrandendo, sfondo attenuato
- desktop: navigazione a sinistra, elenco e mappa affiancati, scheda su due colonne
- Dov'era?: foto a tutto schermo, mappa che si ingrandisce, segnaposto anche da tastiera
- controllo con le Web Interface Guidelines e correzioni
- workspace npm, Dockerfile, README e libretto di Manuel aggiornati

Co-Authored-By: Claude Opus 5.5 <noreply@anthropic.com>
</commit_message>
<xml_diff>
--- a/docs/libretti/manuel-bulla.docx
+++ b/docs/libretti/manuel-bulla.docx
@@ -1896,6 +1896,132 @@
                 <w:szCs w:val="19"/>
               </w:rPr>
               <w:t xml:space="preserve">docs/fase-4-pianificazione.md, docs/fase-2-specifiche-requisiti.md</w:t>
+            </w:r>
+          </w:p>
+        </w:tc>
+      </w:tr>
+      <w:tr>
+        <w:tc>
+          <w:tcPr>
+            <w:tcW w:type="dxa" w:w="1250"/>
+            <w:tcBorders>
+              <w:top w:val="single" w:color="D9CFC0" w:sz="4"/>
+              <w:left w:val="single" w:color="D9CFC0" w:sz="4"/>
+              <w:bottom w:val="single" w:color="D9CFC0" w:sz="4"/>
+              <w:right w:val="single" w:color="D9CFC0" w:sz="4"/>
+            </w:tcBorders>
+            <w:shd w:fill="FBF8F3" w:color="auto" w:val="clear"/>
+            <w:tcMar>
+              <w:top w:type="dxa" w:w="80"/>
+              <w:left w:type="dxa" w:w="110"/>
+              <w:bottom w:type="dxa" w:w="80"/>
+              <w:right w:type="dxa" w:w="110"/>
+            </w:tcMar>
+          </w:tcPr>
+          <w:p>
+            <w:r>
+              <w:rPr>
+                <w:rFonts w:ascii="Calibri" w:cs="Calibri" w:eastAsia="Calibri" w:hAnsi="Calibri"/>
+                <w:b w:val="false"/>
+                <w:bCs w:val="false"/>
+                <w:color w:val="333333"/>
+                <w:sz w:val="19"/>
+                <w:szCs w:val="19"/>
+              </w:rPr>
+              <w:t xml:space="preserve">09/10/2026</w:t>
+            </w:r>
+          </w:p>
+        </w:tc>
+        <w:tc>
+          <w:tcPr>
+            <w:tcW w:type="dxa" w:w="2050"/>
+            <w:tcBorders>
+              <w:top w:val="single" w:color="D9CFC0" w:sz="4"/>
+              <w:left w:val="single" w:color="D9CFC0" w:sz="4"/>
+              <w:bottom w:val="single" w:color="D9CFC0" w:sz="4"/>
+              <w:right w:val="single" w:color="D9CFC0" w:sz="4"/>
+            </w:tcBorders>
+            <w:shd w:fill="FBF8F3" w:color="auto" w:val="clear"/>
+            <w:tcMar>
+              <w:top w:type="dxa" w:w="80"/>
+              <w:left w:type="dxa" w:w="110"/>
+              <w:bottom w:type="dxa" w:w="80"/>
+              <w:right w:type="dxa" w:w="110"/>
+            </w:tcMar>
+          </w:tcPr>
+          <w:p>
+            <w:r>
+              <w:rPr>
+                <w:rFonts w:ascii="Calibri" w:cs="Calibri" w:eastAsia="Calibri" w:hAnsi="Calibri"/>
+                <w:b/>
+                <w:bCs/>
+                <w:color w:val="333333"/>
+                <w:sz w:val="19"/>
+                <w:szCs w:val="19"/>
+              </w:rPr>
+              <w:t xml:space="preserve">Frontend v2 e gioco fotografico</w:t>
+            </w:r>
+          </w:p>
+        </w:tc>
+        <w:tc>
+          <w:tcPr>
+            <w:tcW w:type="dxa" w:w="3450"/>
+            <w:tcBorders>
+              <w:top w:val="single" w:color="D9CFC0" w:sz="4"/>
+              <w:left w:val="single" w:color="D9CFC0" w:sz="4"/>
+              <w:bottom w:val="single" w:color="D9CFC0" w:sz="4"/>
+              <w:right w:val="single" w:color="D9CFC0" w:sz="4"/>
+            </w:tcBorders>
+            <w:shd w:fill="FBF8F3" w:color="auto" w:val="clear"/>
+            <w:tcMar>
+              <w:top w:type="dxa" w:w="80"/>
+              <w:left w:type="dxa" w:w="110"/>
+              <w:bottom w:type="dxa" w:w="80"/>
+              <w:right w:type="dxa" w:w="110"/>
+            </w:tcMar>
+          </w:tcPr>
+          <w:p>
+            <w:r>
+              <w:rPr>
+                <w:rFonts w:ascii="Calibri" w:cs="Calibri" w:eastAsia="Calibri" w:hAnsi="Calibri"/>
+                <w:b w:val="false"/>
+                <w:bCs w:val="false"/>
+                <w:color w:val="333333"/>
+                <w:sz w:val="19"/>
+                <w:szCs w:val="19"/>
+              </w:rPr>
+              <w:t xml:space="preserve">Nuova versione del sito in src/frontend-v2 (npm run dev:v2), costruita sulla v1 collegata al backend: mappa dei luoghi con raggruppamento dei POI vicini, icone di categoria, nomi visibili ingrandendo e sfondo attenuato; layout desktop con elenco e mappa affiancati, scheda su due colonne; copertine con il ritaglio della mappa; nuovo stile (font Geist, icone Phosphor, tema chiaro e scuro). Gioco "Dov'era?" trasformato in stile GeoGuessr: 8 foto storiche di pubblico dominio da Wikimedia Commons al posto degli indizi testuali, con crediti mostrati dopo la risposta (backend: migrazione 002, nuova rotta per le foto, test). Controllo con le Web Interface Guidelines e correzioni (accessibilità da tastiera del gioco, link veri, tipografia, titoli di pagina).</w:t>
+            </w:r>
+          </w:p>
+        </w:tc>
+        <w:tc>
+          <w:tcPr>
+            <w:tcW w:type="dxa" w:w="2276"/>
+            <w:tcBorders>
+              <w:top w:val="single" w:color="D9CFC0" w:sz="4"/>
+              <w:left w:val="single" w:color="D9CFC0" w:sz="4"/>
+              <w:bottom w:val="single" w:color="D9CFC0" w:sz="4"/>
+              <w:right w:val="single" w:color="D9CFC0" w:sz="4"/>
+            </w:tcBorders>
+            <w:shd w:fill="FBF8F3" w:color="auto" w:val="clear"/>
+            <w:tcMar>
+              <w:top w:type="dxa" w:w="80"/>
+              <w:left w:type="dxa" w:w="110"/>
+              <w:bottom w:type="dxa" w:w="80"/>
+              <w:right w:type="dxa" w:w="110"/>
+            </w:tcMar>
+          </w:tcPr>
+          <w:p>
+            <w:r>
+              <w:rPr>
+                <w:rFonts w:ascii="Calibri" w:cs="Calibri" w:eastAsia="Calibri" w:hAnsi="Calibri"/>
+                <w:b w:val="false"/>
+                <w:bCs w:val="false"/>
+                <w:color w:val="333333"/>
+                <w:sz w:val="19"/>
+                <w:szCs w:val="19"/>
+              </w:rPr>
+              <w:t xml:space="preserve">src/frontend-v2/, src/backend/src/db/dati/foto-gioco/</w:t>
             </w:r>
           </w:p>
         </w:tc>

</xml_diff>

<commit_message>
Frontend v2: esperienza da smartphone
- anteprima dei luoghi come pannello dal basso, chiudibile trascinandolo giù;
  la mappa sposta il luogo selezionato nello spazio libero sopra il pannello
- scheda riordinata per chi è sul posto, barra in alto con indietro e condividi
- barra fissa con le tappe dell'itinerario sopra la navigazione
- avvisi sulla posizione che si chiudono da soli, aree di tocco di 44 px,
  campi a 16 px (niente zoom su iPhone), niente hover dopo il tocco
- vibrazione quando si mette il segnaposto nel gioco
- README e libretto di Manuel aggiornati

Co-Authored-By: Claude Opus 5.5 <noreply@anthropic.com>
</commit_message>
<xml_diff>
--- a/docs/libretti/manuel-bulla.docx
+++ b/docs/libretti/manuel-bulla.docx
@@ -2022,6 +2022,128 @@
                 <w:szCs w:val="19"/>
               </w:rPr>
               <w:t xml:space="preserve">src/frontend-v2/, src/backend/src/db/dati/foto-gioco/</w:t>
+            </w:r>
+          </w:p>
+        </w:tc>
+      </w:tr>
+      <w:tr>
+        <w:tc>
+          <w:tcPr>
+            <w:tcW w:type="dxa" w:w="1250"/>
+            <w:tcBorders>
+              <w:top w:val="single" w:color="D9CFC0" w:sz="4"/>
+              <w:left w:val="single" w:color="D9CFC0" w:sz="4"/>
+              <w:bottom w:val="single" w:color="D9CFC0" w:sz="4"/>
+              <w:right w:val="single" w:color="D9CFC0" w:sz="4"/>
+            </w:tcBorders>
+            <w:tcMar>
+              <w:top w:type="dxa" w:w="80"/>
+              <w:left w:type="dxa" w:w="110"/>
+              <w:bottom w:type="dxa" w:w="80"/>
+              <w:right w:type="dxa" w:w="110"/>
+            </w:tcMar>
+          </w:tcPr>
+          <w:p>
+            <w:r>
+              <w:rPr>
+                <w:rFonts w:ascii="Calibri" w:cs="Calibri" w:eastAsia="Calibri" w:hAnsi="Calibri"/>
+                <w:b w:val="false"/>
+                <w:bCs w:val="false"/>
+                <w:color w:val="333333"/>
+                <w:sz w:val="19"/>
+                <w:szCs w:val="19"/>
+              </w:rPr>
+              <w:t xml:space="preserve">09/10/2026</w:t>
+            </w:r>
+          </w:p>
+        </w:tc>
+        <w:tc>
+          <w:tcPr>
+            <w:tcW w:type="dxa" w:w="2050"/>
+            <w:tcBorders>
+              <w:top w:val="single" w:color="D9CFC0" w:sz="4"/>
+              <w:left w:val="single" w:color="D9CFC0" w:sz="4"/>
+              <w:bottom w:val="single" w:color="D9CFC0" w:sz="4"/>
+              <w:right w:val="single" w:color="D9CFC0" w:sz="4"/>
+            </w:tcBorders>
+            <w:tcMar>
+              <w:top w:type="dxa" w:w="80"/>
+              <w:left w:type="dxa" w:w="110"/>
+              <w:bottom w:type="dxa" w:w="80"/>
+              <w:right w:type="dxa" w:w="110"/>
+            </w:tcMar>
+          </w:tcPr>
+          <w:p>
+            <w:r>
+              <w:rPr>
+                <w:rFonts w:ascii="Calibri" w:cs="Calibri" w:eastAsia="Calibri" w:hAnsi="Calibri"/>
+                <w:b/>
+                <w:bCs/>
+                <w:color w:val="333333"/>
+                <w:sz w:val="19"/>
+                <w:szCs w:val="19"/>
+              </w:rPr>
+              <w:t xml:space="preserve">Frontend v2 per smartphone</w:t>
+            </w:r>
+          </w:p>
+        </w:tc>
+        <w:tc>
+          <w:tcPr>
+            <w:tcW w:type="dxa" w:w="3450"/>
+            <w:tcBorders>
+              <w:top w:val="single" w:color="D9CFC0" w:sz="4"/>
+              <w:left w:val="single" w:color="D9CFC0" w:sz="4"/>
+              <w:bottom w:val="single" w:color="D9CFC0" w:sz="4"/>
+              <w:right w:val="single" w:color="D9CFC0" w:sz="4"/>
+            </w:tcBorders>
+            <w:tcMar>
+              <w:top w:type="dxa" w:w="80"/>
+              <w:left w:type="dxa" w:w="110"/>
+              <w:bottom w:type="dxa" w:w="80"/>
+              <w:right w:type="dxa" w:w="110"/>
+            </w:tcMar>
+          </w:tcPr>
+          <w:p>
+            <w:r>
+              <w:rPr>
+                <w:rFonts w:ascii="Calibri" w:cs="Calibri" w:eastAsia="Calibri" w:hAnsi="Calibri"/>
+                <w:b w:val="false"/>
+                <w:bCs w:val="false"/>
+                <w:color w:val="333333"/>
+                <w:sz w:val="19"/>
+                <w:szCs w:val="19"/>
+              </w:rPr>
+              <w:t xml:space="preserve">Revisione della v2 per chi la usa dal telefono: anteprima dei luoghi come pannello dal basso che si chiude trascinandolo, con la mappa che sposta il luogo selezionato nello spazio libero; scheda riordinata (informazioni pratiche e luoghi vicini prima delle fonti) con barra in alto per tornare indietro e condividere il luogo; barra fissa con le tappe dell'itinerario sopra la navigazione; avvisi sulla posizione che si chiudono da soli; aree di tocco di almeno 44 px, campi a 16 px per evitare lo zoom su iPhone, niente effetti hover dopo il tocco; vibrazione quando si mette il segnaposto nel gioco.</w:t>
+            </w:r>
+          </w:p>
+        </w:tc>
+        <w:tc>
+          <w:tcPr>
+            <w:tcW w:type="dxa" w:w="2276"/>
+            <w:tcBorders>
+              <w:top w:val="single" w:color="D9CFC0" w:sz="4"/>
+              <w:left w:val="single" w:color="D9CFC0" w:sz="4"/>
+              <w:bottom w:val="single" w:color="D9CFC0" w:sz="4"/>
+              <w:right w:val="single" w:color="D9CFC0" w:sz="4"/>
+            </w:tcBorders>
+            <w:tcMar>
+              <w:top w:type="dxa" w:w="80"/>
+              <w:left w:type="dxa" w:w="110"/>
+              <w:bottom w:type="dxa" w:w="80"/>
+              <w:right w:type="dxa" w:w="110"/>
+            </w:tcMar>
+          </w:tcPr>
+          <w:p>
+            <w:r>
+              <w:rPr>
+                <w:rFonts w:ascii="Calibri" w:cs="Calibri" w:eastAsia="Calibri" w:hAnsi="Calibri"/>
+                <w:b w:val="false"/>
+                <w:bCs w:val="false"/>
+                <w:color w:val="333333"/>
+                <w:sz w:val="19"/>
+                <w:szCs w:val="19"/>
+              </w:rPr>
+              <w:t xml:space="preserve">src/frontend-v2/</w:t>
             </w:r>
           </w:p>
         </w:tc>

</xml_diff>

<commit_message>
Libretti: aggiornamento della presentazione registrato a Marco Buffa
Co-Authored-By: Claude Opus 5.5 <noreply@anthropic.com>
</commit_message>
<xml_diff>
--- a/docs/libretti/manuel-bulla.docx
+++ b/docs/libretti/manuel-bulla.docx
@@ -2144,132 +2144,6 @@
                 <w:szCs w:val="19"/>
               </w:rPr>
               <w:t xml:space="preserve">src/frontend-v2/</w:t>
-            </w:r>
-          </w:p>
-        </w:tc>
-      </w:tr>
-      <w:tr>
-        <w:tc>
-          <w:tcPr>
-            <w:tcW w:type="dxa" w:w="1250"/>
-            <w:tcBorders>
-              <w:top w:val="single" w:color="D9CFC0" w:sz="4"/>
-              <w:left w:val="single" w:color="D9CFC0" w:sz="4"/>
-              <w:bottom w:val="single" w:color="D9CFC0" w:sz="4"/>
-              <w:right w:val="single" w:color="D9CFC0" w:sz="4"/>
-            </w:tcBorders>
-            <w:shd w:fill="FBF8F3" w:color="auto" w:val="clear"/>
-            <w:tcMar>
-              <w:top w:type="dxa" w:w="80"/>
-              <w:left w:type="dxa" w:w="110"/>
-              <w:bottom w:type="dxa" w:w="80"/>
-              <w:right w:type="dxa" w:w="110"/>
-            </w:tcMar>
-          </w:tcPr>
-          <w:p>
-            <w:r>
-              <w:rPr>
-                <w:rFonts w:ascii="Calibri" w:cs="Calibri" w:eastAsia="Calibri" w:hAnsi="Calibri"/>
-                <w:b w:val="false"/>
-                <w:bCs w:val="false"/>
-                <w:color w:val="333333"/>
-                <w:sz w:val="19"/>
-                <w:szCs w:val="19"/>
-              </w:rPr>
-              <w:t xml:space="preserve">09/10/2026</w:t>
-            </w:r>
-          </w:p>
-        </w:tc>
-        <w:tc>
-          <w:tcPr>
-            <w:tcW w:type="dxa" w:w="2050"/>
-            <w:tcBorders>
-              <w:top w:val="single" w:color="D9CFC0" w:sz="4"/>
-              <w:left w:val="single" w:color="D9CFC0" w:sz="4"/>
-              <w:bottom w:val="single" w:color="D9CFC0" w:sz="4"/>
-              <w:right w:val="single" w:color="D9CFC0" w:sz="4"/>
-            </w:tcBorders>
-            <w:shd w:fill="FBF8F3" w:color="auto" w:val="clear"/>
-            <w:tcMar>
-              <w:top w:type="dxa" w:w="80"/>
-              <w:left w:type="dxa" w:w="110"/>
-              <w:bottom w:type="dxa" w:w="80"/>
-              <w:right w:type="dxa" w:w="110"/>
-            </w:tcMar>
-          </w:tcPr>
-          <w:p>
-            <w:r>
-              <w:rPr>
-                <w:rFonts w:ascii="Calibri" w:cs="Calibri" w:eastAsia="Calibri" w:hAnsi="Calibri"/>
-                <w:b/>
-                <w:bCs/>
-                <w:color w:val="333333"/>
-                <w:sz w:val="19"/>
-                <w:szCs w:val="19"/>
-              </w:rPr>
-              <w:t xml:space="preserve">Aggiornamento presentazione</w:t>
-            </w:r>
-          </w:p>
-        </w:tc>
-        <w:tc>
-          <w:tcPr>
-            <w:tcW w:type="dxa" w:w="3450"/>
-            <w:tcBorders>
-              <w:top w:val="single" w:color="D9CFC0" w:sz="4"/>
-              <w:left w:val="single" w:color="D9CFC0" w:sz="4"/>
-              <w:bottom w:val="single" w:color="D9CFC0" w:sz="4"/>
-              <w:right w:val="single" w:color="D9CFC0" w:sz="4"/>
-            </w:tcBorders>
-            <w:shd w:fill="FBF8F3" w:color="auto" w:val="clear"/>
-            <w:tcMar>
-              <w:top w:type="dxa" w:w="80"/>
-              <w:left w:type="dxa" w:w="110"/>
-              <w:bottom w:type="dxa" w:w="80"/>
-              <w:right w:type="dxa" w:w="110"/>
-            </w:tcMar>
-          </w:tcPr>
-          <w:p>
-            <w:r>
-              <w:rPr>
-                <w:rFonts w:ascii="Calibri" w:cs="Calibri" w:eastAsia="Calibri" w:hAnsi="Calibri"/>
-                <w:b w:val="false"/>
-                <w:bCs w:val="false"/>
-                <w:color w:val="333333"/>
-                <w:sz w:val="19"/>
-                <w:szCs w:val="19"/>
-              </w:rPr>
-              <w:t xml:space="preserve">Pubblicata nel repository la versione aggiornata della presentazione del progetto.</w:t>
-            </w:r>
-          </w:p>
-        </w:tc>
-        <w:tc>
-          <w:tcPr>
-            <w:tcW w:type="dxa" w:w="2276"/>
-            <w:tcBorders>
-              <w:top w:val="single" w:color="D9CFC0" w:sz="4"/>
-              <w:left w:val="single" w:color="D9CFC0" w:sz="4"/>
-              <w:bottom w:val="single" w:color="D9CFC0" w:sz="4"/>
-              <w:right w:val="single" w:color="D9CFC0" w:sz="4"/>
-            </w:tcBorders>
-            <w:shd w:fill="FBF8F3" w:color="auto" w:val="clear"/>
-            <w:tcMar>
-              <w:top w:type="dxa" w:w="80"/>
-              <w:left w:type="dxa" w:w="110"/>
-              <w:bottom w:type="dxa" w:w="80"/>
-              <w:right w:type="dxa" w:w="110"/>
-            </w:tcMar>
-          </w:tcPr>
-          <w:p>
-            <w:r>
-              <w:rPr>
-                <w:rFonts w:ascii="Calibri" w:cs="Calibri" w:eastAsia="Calibri" w:hAnsi="Calibri"/>
-                <w:b w:val="false"/>
-                <w:bCs w:val="false"/>
-                <w:color w:val="333333"/>
-                <w:sz w:val="19"/>
-                <w:szCs w:val="19"/>
-              </w:rPr>
-              <w:t xml:space="preserve">presentazioni/presentazione-v2.pptx</w:t>
             </w:r>
           </w:p>
         </w:tc>

</xml_diff>

<commit_message>
Libretto Manuel: pulizia dello spazio di lavoro
Registrata nel libretto la pulizia delle cartelle dopo la separazione tra
versione corrente e versioni precedenti.

Co-Authored-By: Claude Sonnet 5.5 <noreply@anthropic.com>
</commit_message>
<xml_diff>
--- a/docs/libretti/manuel-bulla.docx
+++ b/docs/libretti/manuel-bulla.docx
@@ -2144,6 +2144,132 @@
                 <w:szCs w:val="19"/>
               </w:rPr>
               <w:t xml:space="preserve">src/frontend-v2/</w:t>
+            </w:r>
+          </w:p>
+        </w:tc>
+      </w:tr>
+      <w:tr>
+        <w:tc>
+          <w:tcPr>
+            <w:tcW w:type="dxa" w:w="1250"/>
+            <w:tcBorders>
+              <w:top w:val="single" w:color="D9CFC0" w:sz="4"/>
+              <w:left w:val="single" w:color="D9CFC0" w:sz="4"/>
+              <w:bottom w:val="single" w:color="D9CFC0" w:sz="4"/>
+              <w:right w:val="single" w:color="D9CFC0" w:sz="4"/>
+            </w:tcBorders>
+            <w:shd w:fill="FBF8F3" w:color="auto" w:val="clear"/>
+            <w:tcMar>
+              <w:top w:type="dxa" w:w="80"/>
+              <w:left w:type="dxa" w:w="110"/>
+              <w:bottom w:type="dxa" w:w="80"/>
+              <w:right w:type="dxa" w:w="110"/>
+            </w:tcMar>
+          </w:tcPr>
+          <w:p>
+            <w:r>
+              <w:rPr>
+                <w:rFonts w:ascii="Calibri" w:cs="Calibri" w:eastAsia="Calibri" w:hAnsi="Calibri"/>
+                <w:b w:val="false"/>
+                <w:bCs w:val="false"/>
+                <w:color w:val="333333"/>
+                <w:sz w:val="19"/>
+                <w:szCs w:val="19"/>
+              </w:rPr>
+              <w:t xml:space="preserve">09/10/2026</w:t>
+            </w:r>
+          </w:p>
+        </w:tc>
+        <w:tc>
+          <w:tcPr>
+            <w:tcW w:type="dxa" w:w="2050"/>
+            <w:tcBorders>
+              <w:top w:val="single" w:color="D9CFC0" w:sz="4"/>
+              <w:left w:val="single" w:color="D9CFC0" w:sz="4"/>
+              <w:bottom w:val="single" w:color="D9CFC0" w:sz="4"/>
+              <w:right w:val="single" w:color="D9CFC0" w:sz="4"/>
+            </w:tcBorders>
+            <w:shd w:fill="FBF8F3" w:color="auto" w:val="clear"/>
+            <w:tcMar>
+              <w:top w:type="dxa" w:w="80"/>
+              <w:left w:type="dxa" w:w="110"/>
+              <w:bottom w:type="dxa" w:w="80"/>
+              <w:right w:type="dxa" w:w="110"/>
+            </w:tcMar>
+          </w:tcPr>
+          <w:p>
+            <w:r>
+              <w:rPr>
+                <w:rFonts w:ascii="Calibri" w:cs="Calibri" w:eastAsia="Calibri" w:hAnsi="Calibri"/>
+                <w:b/>
+                <w:bCs/>
+                <w:color w:val="333333"/>
+                <w:sz w:val="19"/>
+                <w:szCs w:val="19"/>
+              </w:rPr>
+              <w:t xml:space="preserve">Pulizia dello spazio di lavoro</w:t>
+            </w:r>
+          </w:p>
+        </w:tc>
+        <w:tc>
+          <w:tcPr>
+            <w:tcW w:type="dxa" w:w="3450"/>
+            <w:tcBorders>
+              <w:top w:val="single" w:color="D9CFC0" w:sz="4"/>
+              <w:left w:val="single" w:color="D9CFC0" w:sz="4"/>
+              <w:bottom w:val="single" w:color="D9CFC0" w:sz="4"/>
+              <w:right w:val="single" w:color="D9CFC0" w:sz="4"/>
+            </w:tcBorders>
+            <w:shd w:fill="FBF8F3" w:color="auto" w:val="clear"/>
+            <w:tcMar>
+              <w:top w:type="dxa" w:w="80"/>
+              <w:left w:type="dxa" w:w="110"/>
+              <w:bottom w:type="dxa" w:w="80"/>
+              <w:right w:type="dxa" w:w="110"/>
+            </w:tcMar>
+          </w:tcPr>
+          <w:p>
+            <w:r>
+              <w:rPr>
+                <w:rFonts w:ascii="Calibri" w:cs="Calibri" w:eastAsia="Calibri" w:hAnsi="Calibri"/>
+                <w:b w:val="false"/>
+                <w:bCs w:val="false"/>
+                <w:color w:val="333333"/>
+                <w:sz w:val="19"/>
+                <w:szCs w:val="19"/>
+              </w:rPr>
+              <w:t xml:space="preserve">Riordino delle cartelle dopo la separazione della versione corrente dalle versioni precedenti: rimossa la cartella src/ rimasta dal vecchio layout (build, cache e un vecchio database di prova), chiusi i server di sviluppo ancora avviati da lì, ricollegate le dipendenze dei workspace a versione-corrente/ e rieseguiti i test (7 del frontend e 146 del backend, tutti superati). Eliminato il branch locale già unito a main. La struttura del repository è stata verificata rispetto al README.</w:t>
+            </w:r>
+          </w:p>
+        </w:tc>
+        <w:tc>
+          <w:tcPr>
+            <w:tcW w:type="dxa" w:w="2276"/>
+            <w:tcBorders>
+              <w:top w:val="single" w:color="D9CFC0" w:sz="4"/>
+              <w:left w:val="single" w:color="D9CFC0" w:sz="4"/>
+              <w:bottom w:val="single" w:color="D9CFC0" w:sz="4"/>
+              <w:right w:val="single" w:color="D9CFC0" w:sz="4"/>
+            </w:tcBorders>
+            <w:shd w:fill="FBF8F3" w:color="auto" w:val="clear"/>
+            <w:tcMar>
+              <w:top w:type="dxa" w:w="80"/>
+              <w:left w:type="dxa" w:w="110"/>
+              <w:bottom w:type="dxa" w:w="80"/>
+              <w:right w:type="dxa" w:w="110"/>
+            </w:tcMar>
+          </w:tcPr>
+          <w:p>
+            <w:r>
+              <w:rPr>
+                <w:rFonts w:ascii="Calibri" w:cs="Calibri" w:eastAsia="Calibri" w:hAnsi="Calibri"/>
+                <w:b w:val="false"/>
+                <w:bCs w:val="false"/>
+                <w:color w:val="333333"/>
+                <w:sz w:val="19"/>
+                <w:szCs w:val="19"/>
+              </w:rPr>
+              <w:t xml:space="preserve">Spazio di lavoro locale; struttura del README invariata</w:t>
             </w:r>
           </w:p>
         </w:tc>

</xml_diff>

<commit_message>
Aggiungi il documento cose-mancanti: cosa manca rispetto alla Fase 2
Elenca ciò che nella versione corrente del sito manca, o c'è solo in
parte, rispetto ai requisiti della Fase 2 (v0.4): requisiti Must, Should
e Could, flussi ed eccezioni dei casi d'uso e rinvii già decisi dalla
Fase 4.

Registrata l'attività nel libretto di Manuel.

Co-Authored-By: Claude Sonnet 5.5 <noreply@anthropic.com>
</commit_message>
<xml_diff>
--- a/docs/libretti/manuel-bulla.docx
+++ b/docs/libretti/manuel-bulla.docx
@@ -2270,6 +2270,128 @@
                 <w:szCs w:val="19"/>
               </w:rPr>
               <w:t xml:space="preserve">Spazio di lavoro locale; struttura del README invariata</w:t>
+            </w:r>
+          </w:p>
+        </w:tc>
+      </w:tr>
+      <w:tr>
+        <w:tc>
+          <w:tcPr>
+            <w:tcW w:type="dxa" w:w="1250"/>
+            <w:tcBorders>
+              <w:top w:val="single" w:color="D9CFC0" w:sz="4"/>
+              <w:left w:val="single" w:color="D9CFC0" w:sz="4"/>
+              <w:bottom w:val="single" w:color="D9CFC0" w:sz="4"/>
+              <w:right w:val="single" w:color="D9CFC0" w:sz="4"/>
+            </w:tcBorders>
+            <w:tcMar>
+              <w:top w:type="dxa" w:w="80"/>
+              <w:left w:type="dxa" w:w="110"/>
+              <w:bottom w:type="dxa" w:w="80"/>
+              <w:right w:type="dxa" w:w="110"/>
+            </w:tcMar>
+          </w:tcPr>
+          <w:p>
+            <w:r>
+              <w:rPr>
+                <w:rFonts w:ascii="Calibri" w:cs="Calibri" w:eastAsia="Calibri" w:hAnsi="Calibri"/>
+                <w:b w:val="false"/>
+                <w:bCs w:val="false"/>
+                <w:color w:val="333333"/>
+                <w:sz w:val="19"/>
+                <w:szCs w:val="19"/>
+              </w:rPr>
+              <w:t xml:space="preserve">09/10/2026</w:t>
+            </w:r>
+          </w:p>
+        </w:tc>
+        <w:tc>
+          <w:tcPr>
+            <w:tcW w:type="dxa" w:w="2050"/>
+            <w:tcBorders>
+              <w:top w:val="single" w:color="D9CFC0" w:sz="4"/>
+              <w:left w:val="single" w:color="D9CFC0" w:sz="4"/>
+              <w:bottom w:val="single" w:color="D9CFC0" w:sz="4"/>
+              <w:right w:val="single" w:color="D9CFC0" w:sz="4"/>
+            </w:tcBorders>
+            <w:tcMar>
+              <w:top w:type="dxa" w:w="80"/>
+              <w:left w:type="dxa" w:w="110"/>
+              <w:bottom w:type="dxa" w:w="80"/>
+              <w:right w:type="dxa" w:w="110"/>
+            </w:tcMar>
+          </w:tcPr>
+          <w:p>
+            <w:r>
+              <w:rPr>
+                <w:rFonts w:ascii="Calibri" w:cs="Calibri" w:eastAsia="Calibri" w:hAnsi="Calibri"/>
+                <w:b/>
+                <w:bCs/>
+                <w:color w:val="333333"/>
+                <w:sz w:val="19"/>
+                <w:szCs w:val="19"/>
+              </w:rPr>
+              <w:t xml:space="preserve">Controllo dei requisiti della Fase 2</w:t>
+            </w:r>
+          </w:p>
+        </w:tc>
+        <w:tc>
+          <w:tcPr>
+            <w:tcW w:type="dxa" w:w="3450"/>
+            <w:tcBorders>
+              <w:top w:val="single" w:color="D9CFC0" w:sz="4"/>
+              <w:left w:val="single" w:color="D9CFC0" w:sz="4"/>
+              <w:bottom w:val="single" w:color="D9CFC0" w:sz="4"/>
+              <w:right w:val="single" w:color="D9CFC0" w:sz="4"/>
+            </w:tcBorders>
+            <w:tcMar>
+              <w:top w:type="dxa" w:w="80"/>
+              <w:left w:type="dxa" w:w="110"/>
+              <w:bottom w:type="dxa" w:w="80"/>
+              <w:right w:type="dxa" w:w="110"/>
+            </w:tcMar>
+          </w:tcPr>
+          <w:p>
+            <w:r>
+              <w:rPr>
+                <w:rFonts w:ascii="Calibri" w:cs="Calibri" w:eastAsia="Calibri" w:hAnsi="Calibri"/>
+                <w:b w:val="false"/>
+                <w:bCs w:val="false"/>
+                <w:color w:val="333333"/>
+                <w:sz w:val="19"/>
+                <w:szCs w:val="19"/>
+              </w:rPr>
+              <w:t xml:space="preserve">Verifica della versione corrente del sito rispetto ai requisiti della Fase 2 (v0.4): requisiti funzionali e non funzionali, casi d'uso con flussi alternativi ed eccezioni. Lettura del codice di frontend e backend, esecuzione dei test (7 del frontend e 146 del backend, tutti superati), prove a 360 px di larghezza e in assenza di connessione, build di produzione. Risultato raccolto in un nuovo documento: i requisiti funzionali Must e Should sono tutti presenti; mancano o sono incompleti l'informativa privacy, la configurazione HTTPS, parte delle eccezioni dei casi d'uso, le foto dei luoghi e alcuni requisiti Could.</w:t>
+            </w:r>
+          </w:p>
+        </w:tc>
+        <w:tc>
+          <w:tcPr>
+            <w:tcW w:type="dxa" w:w="2276"/>
+            <w:tcBorders>
+              <w:top w:val="single" w:color="D9CFC0" w:sz="4"/>
+              <w:left w:val="single" w:color="D9CFC0" w:sz="4"/>
+              <w:bottom w:val="single" w:color="D9CFC0" w:sz="4"/>
+              <w:right w:val="single" w:color="D9CFC0" w:sz="4"/>
+            </w:tcBorders>
+            <w:tcMar>
+              <w:top w:type="dxa" w:w="80"/>
+              <w:left w:type="dxa" w:w="110"/>
+              <w:bottom w:type="dxa" w:w="80"/>
+              <w:right w:type="dxa" w:w="110"/>
+            </w:tcMar>
+          </w:tcPr>
+          <w:p>
+            <w:r>
+              <w:rPr>
+                <w:rFonts w:ascii="Calibri" w:cs="Calibri" w:eastAsia="Calibri" w:hAnsi="Calibri"/>
+                <w:b w:val="false"/>
+                <w:bCs w:val="false"/>
+                <w:color w:val="333333"/>
+                <w:sz w:val="19"/>
+                <w:szCs w:val="19"/>
+              </w:rPr>
+              <w:t xml:space="preserve">docs/cose-mancanti.md</w:t>
             </w:r>
           </w:p>
         </w:tc>

</xml_diff>

<commit_message>
Aggiorna cose-mancanti alla v0.2: secondo controllo sul frontend v3
Ricontrolla sul codice e sul sito in funzione le 26 voci della v0.1: 17
risultano chiuse e verificate; 9 restano aperte (foto dei luoghi, compiti
del titolare per la privacy, prove con persone e dispositivi reali,
riconoscimento dall'immagine) o non sono riverificabili qui (HTTPS con
Caddy, Docker, test di carico).

Aggiunte le sezioni sulle voci chiuse, su quelle dichiarate dal team e
sulla documentazione da riallineare.

Registrata l'attività nel libretto di Manuel.

Co-Authored-By: Claude Sonnet 5.5 <noreply@anthropic.com>
</commit_message>
<xml_diff>
--- a/docs/libretti/manuel-bulla.docx
+++ b/docs/libretti/manuel-bulla.docx
@@ -2374,6 +2374,132 @@
               <w:bottom w:val="single" w:color="D9CFC0" w:sz="4"/>
               <w:right w:val="single" w:color="D9CFC0" w:sz="4"/>
             </w:tcBorders>
+            <w:tcMar>
+              <w:top w:type="dxa" w:w="80"/>
+              <w:left w:type="dxa" w:w="110"/>
+              <w:bottom w:type="dxa" w:w="80"/>
+              <w:right w:type="dxa" w:w="110"/>
+            </w:tcMar>
+          </w:tcPr>
+          <w:p>
+            <w:r>
+              <w:rPr>
+                <w:rFonts w:ascii="Calibri" w:cs="Calibri" w:eastAsia="Calibri" w:hAnsi="Calibri"/>
+                <w:b w:val="false"/>
+                <w:bCs w:val="false"/>
+                <w:color w:val="333333"/>
+                <w:sz w:val="19"/>
+                <w:szCs w:val="19"/>
+              </w:rPr>
+              <w:t xml:space="preserve">docs/cose-mancanti.md</w:t>
+            </w:r>
+          </w:p>
+        </w:tc>
+      </w:tr>
+      <w:tr>
+        <w:tc>
+          <w:tcPr>
+            <w:tcW w:type="dxa" w:w="1250"/>
+            <w:tcBorders>
+              <w:top w:val="single" w:color="D9CFC0" w:sz="4"/>
+              <w:left w:val="single" w:color="D9CFC0" w:sz="4"/>
+              <w:bottom w:val="single" w:color="D9CFC0" w:sz="4"/>
+              <w:right w:val="single" w:color="D9CFC0" w:sz="4"/>
+            </w:tcBorders>
+            <w:shd w:fill="FBF8F3" w:color="auto" w:val="clear"/>
+            <w:tcMar>
+              <w:top w:type="dxa" w:w="80"/>
+              <w:left w:type="dxa" w:w="110"/>
+              <w:bottom w:type="dxa" w:w="80"/>
+              <w:right w:type="dxa" w:w="110"/>
+            </w:tcMar>
+          </w:tcPr>
+          <w:p>
+            <w:r>
+              <w:rPr>
+                <w:rFonts w:ascii="Calibri" w:cs="Calibri" w:eastAsia="Calibri" w:hAnsi="Calibri"/>
+                <w:b w:val="false"/>
+                <w:bCs w:val="false"/>
+                <w:color w:val="333333"/>
+                <w:sz w:val="19"/>
+                <w:szCs w:val="19"/>
+              </w:rPr>
+              <w:t xml:space="preserve">10/10/2026</w:t>
+            </w:r>
+          </w:p>
+        </w:tc>
+        <w:tc>
+          <w:tcPr>
+            <w:tcW w:type="dxa" w:w="2050"/>
+            <w:tcBorders>
+              <w:top w:val="single" w:color="D9CFC0" w:sz="4"/>
+              <w:left w:val="single" w:color="D9CFC0" w:sz="4"/>
+              <w:bottom w:val="single" w:color="D9CFC0" w:sz="4"/>
+              <w:right w:val="single" w:color="D9CFC0" w:sz="4"/>
+            </w:tcBorders>
+            <w:shd w:fill="FBF8F3" w:color="auto" w:val="clear"/>
+            <w:tcMar>
+              <w:top w:type="dxa" w:w="80"/>
+              <w:left w:type="dxa" w:w="110"/>
+              <w:bottom w:type="dxa" w:w="80"/>
+              <w:right w:type="dxa" w:w="110"/>
+            </w:tcMar>
+          </w:tcPr>
+          <w:p>
+            <w:r>
+              <w:rPr>
+                <w:rFonts w:ascii="Calibri" w:cs="Calibri" w:eastAsia="Calibri" w:hAnsi="Calibri"/>
+                <w:b/>
+                <w:bCs/>
+                <w:color w:val="333333"/>
+                <w:sz w:val="19"/>
+                <w:szCs w:val="19"/>
+              </w:rPr>
+              <w:t xml:space="preserve">Secondo controllo dei requisiti della Fase 2</w:t>
+            </w:r>
+          </w:p>
+        </w:tc>
+        <w:tc>
+          <w:tcPr>
+            <w:tcW w:type="dxa" w:w="3450"/>
+            <w:tcBorders>
+              <w:top w:val="single" w:color="D9CFC0" w:sz="4"/>
+              <w:left w:val="single" w:color="D9CFC0" w:sz="4"/>
+              <w:bottom w:val="single" w:color="D9CFC0" w:sz="4"/>
+              <w:right w:val="single" w:color="D9CFC0" w:sz="4"/>
+            </w:tcBorders>
+            <w:shd w:fill="FBF8F3" w:color="auto" w:val="clear"/>
+            <w:tcMar>
+              <w:top w:type="dxa" w:w="80"/>
+              <w:left w:type="dxa" w:w="110"/>
+              <w:bottom w:type="dxa" w:w="80"/>
+              <w:right w:type="dxa" w:w="110"/>
+            </w:tcMar>
+          </w:tcPr>
+          <w:p>
+            <w:r>
+              <w:rPr>
+                <w:rFonts w:ascii="Calibri" w:cs="Calibri" w:eastAsia="Calibri" w:hAnsi="Calibri"/>
+                <w:b w:val="false"/>
+                <w:bCs w:val="false"/>
+                <w:color w:val="333333"/>
+                <w:sz w:val="19"/>
+                <w:szCs w:val="19"/>
+              </w:rPr>
+              <w:t xml:space="preserve">Nuova verifica della versione corrente (frontend v3) dopo il completamento dei punti del documento Cose mancanti: lettura delle modifiche, test (11 del frontend e 274 del backend, tutti superati), prove a 360 px di larghezza, senza connessione e con Chrome (installazione come app, apertura senza rete, tempi su rete simulata, mappa allargata). Il documento è passato alla versione 0.2: 17 voci su 26 risultano chiuse; restano le foto dei luoghi (lo script di scaricamento va eseguito e la scelta rivista), i compiti del titolare per la privacy, la verifica con la Soprintendenza e le prove con persone e dispositivi reali.</w:t>
+            </w:r>
+          </w:p>
+        </w:tc>
+        <w:tc>
+          <w:tcPr>
+            <w:tcW w:type="dxa" w:w="2276"/>
+            <w:tcBorders>
+              <w:top w:val="single" w:color="D9CFC0" w:sz="4"/>
+              <w:left w:val="single" w:color="D9CFC0" w:sz="4"/>
+              <w:bottom w:val="single" w:color="D9CFC0" w:sz="4"/>
+              <w:right w:val="single" w:color="D9CFC0" w:sz="4"/>
+            </w:tcBorders>
+            <w:shd w:fill="FBF8F3" w:color="auto" w:val="clear"/>
             <w:tcMar>
               <w:top w:type="dxa" w:w="80"/>
               <w:left w:type="dxa" w:w="110"/>

</xml_diff>